<commit_message>
Integrate multilingual guides, reviewed illustrations, and site quality fixes
</commit_message>
<xml_diff>
--- a/en/wisdom-stories/friend-of-allah.docx
+++ b/en/wisdom-stories/friend-of-allah.docx
@@ -53,7 +53,7 @@
         <w:rPr>
           <w:lang/>
         </w:rPr>
-        <w:t>“Are you God?”</w:t>
+        <w:t>“Are you Allah?”</w:t>
       </w:r>
     </w:p>
     <w:p>
@@ -105,7 +105,7 @@
         <w:rPr>
           <w:lang/>
         </w:rPr>
-        <w:t>“Then you must be a friend of God. Last night, I was crying, and I told Him I didn’t have any shoes.”</w:t>
+        <w:t>“Then you must be a friend of Allah. Last night, I was crying, and I told Him I didn’t have any shoes.”</w:t>
       </w:r>
     </w:p>
     <w:p>

</xml_diff>